<commit_message>
added back end acrhitecture
</commit_message>
<xml_diff>
--- a/docs/TasteBudz_Project_Concept_Review.docx
+++ b/docs/TasteBudz_Project_Concept_Review.docx
@@ -7,7 +7,7 @@
         <w:pStyle w:val="Heading1"/>
       </w:pPr>
       <w:r>
-        <w:t>TasteMatch Project Concept Review</w:t>
+        <w:t>TasteBudz Project Concept Review</w:t>
       </w:r>
     </w:p>
     <w:p>
@@ -20,7 +20,7 @@
     </w:p>
     <w:p>
       <w:r>
-        <w:t>TasteMatch is a food-centered social matching platform that connects people based on cuisine preferences, dietary compatibility, location proximity, social goals (friends, dating, networking), and availability windows.</w:t>
+        <w:t>TasteBudz is a food-centered social matching platform that connects people based on cuisine preferences, dietary compatibility, location proximity, social goals (friends, dating, networking), and availability windows.</w:t>
         <w:br/>
         <w:br/>
         <w:t>The purpose is to reduce friction in trying new restaurants, meeting new people, and coordinating dining plans. It is positioned as a social coordination layer around food rather than purely a dating app or restaurant discovery tool.</w:t>

</xml_diff>